<commit_message>
Subir propuesta con modificaciones aprobada
</commit_message>
<xml_diff>
--- a/SE_Propuesta_Santacruz_Usme.docx
+++ b/SE_Propuesta_Santacruz_Usme.docx
@@ -1872,7 +1872,43 @@
         <w:rPr>
           <w:lang w:eastAsia="es-CO"/>
         </w:rPr>
-        <w:t>Desarrollar un sistema web para la gestión de proveedores y compras en pequeñas y medianas empresas, que permita centralizar la información, controlar órdenes de compra y administrar usuarios mediante roles.</w:t>
+        <w:t>Desarrollar un sistema web para la gestión de proveedores y compras en pequeñas y medianas empresas, que permita centraliza</w:t>
+      </w:r>
+      <w:r>
+        <w:rPr>
+          <w:lang w:eastAsia="es-CO"/>
+        </w:rPr>
+        <w:t>ción</w:t>
+      </w:r>
+      <w:r>
+        <w:rPr>
+          <w:lang w:eastAsia="es-CO"/>
+        </w:rPr>
+        <w:t xml:space="preserve"> la información, control</w:t>
+      </w:r>
+      <w:r>
+        <w:rPr>
+          <w:lang w:eastAsia="es-CO"/>
+        </w:rPr>
+        <w:t xml:space="preserve"> de</w:t>
+      </w:r>
+      <w:r>
+        <w:rPr>
+          <w:lang w:eastAsia="es-CO"/>
+        </w:rPr>
+        <w:t xml:space="preserve"> órdenes de compra y administr</w:t>
+      </w:r>
+      <w:r>
+        <w:rPr>
+          <w:lang w:eastAsia="es-CO"/>
+        </w:rPr>
+        <w:t>ación de</w:t>
+      </w:r>
+      <w:r>
+        <w:rPr>
+          <w:lang w:eastAsia="es-CO"/>
+        </w:rPr>
+        <w:t xml:space="preserve"> usuarios mediante roles.</w:t>
       </w:r>
     </w:p>
     <w:p>
@@ -1929,81 +1965,6 @@
         </w:rPr>
         <w:t>a</w:t>
       </w:r>
-    </w:p>
-    <w:p>
-      <w:pPr>
-        <w:widowControl w:val="0"/>
-        <w:jc w:val="both"/>
-        <w:rPr>
-          <w:highlight w:val="red"/>
-          <w:lang w:eastAsia="es-CO"/>
-        </w:rPr>
-      </w:pPr>
-      <w:r>
-        <w:rPr>
-          <w:highlight w:val="red"/>
-          <w:lang w:eastAsia="es-CO"/>
-        </w:rPr>
-        <w:t xml:space="preserve">[ORIENTACIÓN: </w:t>
-      </w:r>
-      <w:r>
-        <w:rPr>
-          <w:highlight w:val="red"/>
-          <w:lang w:eastAsia="es-CO"/>
-        </w:rPr>
-        <w:t xml:space="preserve">La siguiente tabla debe presentarse para cada uno de </w:t>
-      </w:r>
-      <w:r>
-        <w:rPr>
-          <w:highlight w:val="red"/>
-          <w:lang w:eastAsia="es-CO"/>
-        </w:rPr>
-        <w:t xml:space="preserve">los objetivos específicos, </w:t>
-      </w:r>
-      <w:r>
-        <w:rPr>
-          <w:highlight w:val="red"/>
-          <w:lang w:eastAsia="es-CO"/>
-        </w:rPr>
-        <w:t xml:space="preserve">incluyendo </w:t>
-      </w:r>
-      <w:r>
-        <w:rPr>
-          <w:highlight w:val="red"/>
-          <w:lang w:eastAsia="es-CO"/>
-        </w:rPr>
-        <w:t>la metodología para lograr dicho objetivo, los alcances y las actividades a realizar. Para cada actividad debe especificar</w:t>
-      </w:r>
-      <w:r>
-        <w:rPr>
-          <w:highlight w:val="red"/>
-          <w:lang w:eastAsia="es-CO"/>
-        </w:rPr>
-        <w:t>se</w:t>
-      </w:r>
-      <w:r>
-        <w:rPr>
-          <w:highlight w:val="red"/>
-          <w:lang w:eastAsia="es-CO"/>
-        </w:rPr>
-        <w:t xml:space="preserve"> los meses en los cuáles piensa desarrollarla</w:t>
-      </w:r>
-      <w:r>
-        <w:rPr>
-          <w:highlight w:val="red"/>
-          <w:lang w:eastAsia="es-CO"/>
-        </w:rPr>
-        <w:t>.</w:t>
-      </w:r>
-    </w:p>
-    <w:p>
-      <w:pPr>
-        <w:spacing w:after="200" w:line="276" w:lineRule="auto"/>
-        <w:rPr>
-          <w:highlight w:val="red"/>
-          <w:lang w:eastAsia="es-CO"/>
-        </w:rPr>
-      </w:pPr>
     </w:p>
     <w:p>
       <w:pPr>
@@ -7654,15 +7615,7 @@
                 <w:color w:val="000000"/>
                 <w:lang w:val="es-CO"/>
               </w:rPr>
-              <w:t>s</w:t>
-            </w:r>
-            <w:r>
-              <w:rPr>
-                <w:rFonts w:ascii="Calibri" w:eastAsia="Times New Roman" w:hAnsi="Calibri" w:cs="Calibri"/>
-                <w:color w:val="000000"/>
-                <w:lang w:val="es-CO"/>
-              </w:rPr>
-              <w:t>oft</w:t>
+              <w:t>soft</w:t>
             </w:r>
             <w:proofErr w:type="spellEnd"/>
             <w:r>
@@ -8867,7 +8820,6 @@
               <w:rPr>
                 <w:rFonts w:ascii="Calibri" w:eastAsia="Times New Roman" w:hAnsi="Calibri" w:cs="Calibri"/>
                 <w:color w:val="000000"/>
-                <w:lang w:val="en-US"/>
               </w:rPr>
             </w:pPr>
             <w:r>
@@ -8904,7 +8856,6 @@
               <w:rPr>
                 <w:rFonts w:ascii="Calibri" w:eastAsia="Times New Roman" w:hAnsi="Calibri" w:cs="Calibri"/>
                 <w:color w:val="000000"/>
-                <w:lang w:val="en-US"/>
               </w:rPr>
               <w:t> </w:t>
             </w:r>
@@ -9105,7 +9056,6 @@
               <w:rPr>
                 <w:rFonts w:ascii="Calibri" w:eastAsia="Times New Roman" w:hAnsi="Calibri" w:cs="Calibri"/>
                 <w:color w:val="000000"/>
-                <w:lang w:val="en-US"/>
               </w:rPr>
             </w:pPr>
             <w:r>
@@ -9141,9 +9091,16 @@
               <w:rPr>
                 <w:rFonts w:ascii="Calibri" w:eastAsia="Times New Roman" w:hAnsi="Calibri" w:cs="Calibri"/>
                 <w:color w:val="000000"/>
-                <w:lang w:val="en-US"/>
-              </w:rPr>
-              <w:t xml:space="preserve"> X</w:t>
+              </w:rPr>
+              <w:t xml:space="preserve"> </w:t>
+            </w:r>
+            <w:r>
+              <w:rPr>
+                <w:rFonts w:ascii="Calibri" w:eastAsia="Times New Roman" w:hAnsi="Calibri" w:cs="Calibri"/>
+                <w:color w:val="000000"/>
+                <w:lang w:val="en-US"/>
+              </w:rPr>
+              <w:t>X</w:t>
             </w:r>
           </w:p>
         </w:tc>
@@ -15534,6 +15491,7 @@
   <w:style w:type="character" w:default="1" w:styleId="Fuentedeprrafopredeter">
     <w:name w:val="Default Paragraph Font"/>
     <w:uiPriority w:val="1"/>
+    <w:semiHidden/>
     <w:unhideWhenUsed/>
   </w:style>
   <w:style w:type="table" w:default="1" w:styleId="Tablanormal">
@@ -16240,10 +16198,21 @@
 </file>
 
 <file path=customXml/item1.xml><?xml version="1.0" encoding="utf-8"?>
-<b:Sources xmlns:b="http://schemas.openxmlformats.org/officeDocument/2006/bibliography" xmlns="http://schemas.openxmlformats.org/officeDocument/2006/bibliography" SelectedStyle="\apasixtheditionofficeonline.xsl" StyleName="APA" Version="6"/>
+<p:properties xmlns:p="http://schemas.microsoft.com/office/2006/metadata/properties" xmlns:xsi="http://www.w3.org/2001/XMLSchema-instance" xmlns:pc="http://schemas.microsoft.com/office/infopath/2007/PartnerControls">
+  <documentManagement/>
+</p:properties>
 </file>
 
 <file path=customXml/item2.xml><?xml version="1.0" encoding="utf-8"?>
+<?mso-contentType ?>
+<FormTemplates xmlns="http://schemas.microsoft.com/sharepoint/v3/contenttype/forms">
+  <Display>DocumentLibraryForm</Display>
+  <Edit>DocumentLibraryForm</Edit>
+  <New>DocumentLibraryForm</New>
+</FormTemplates>
+</file>
+
+<file path=customXml/item3.xml><?xml version="1.0" encoding="utf-8"?>
 <ct:contentTypeSchema xmlns:ct="http://schemas.microsoft.com/office/2006/metadata/contentType" xmlns:ma="http://schemas.microsoft.com/office/2006/metadata/properties/metaAttributes" ct:_="" ma:_="" ma:contentTypeName="Document" ma:contentTypeID="0x01010027583BE26AEF984D8AF4CE30D06F6F68" ma:contentTypeVersion="0" ma:contentTypeDescription="Create a new document." ma:contentTypeScope="" ma:versionID="2716d5ebba1db67f8d2d8e629181857a">
   <xsd:schema xmlns:xsd="http://www.w3.org/2001/XMLSchema" xmlns:xs="http://www.w3.org/2001/XMLSchema" xmlns:p="http://schemas.microsoft.com/office/2006/metadata/properties" targetNamespace="http://schemas.microsoft.com/office/2006/metadata/properties" ma:root="true" ma:fieldsID="500c6692915ba10984c0aabd49f31b22">
     <xsd:element name="properties">
@@ -16357,30 +16326,28 @@
 </ct:contentTypeSchema>
 </file>
 
-<file path=customXml/item3.xml><?xml version="1.0" encoding="utf-8"?>
-<?mso-contentType ?>
-<FormTemplates xmlns="http://schemas.microsoft.com/sharepoint/v3/contenttype/forms">
-  <Display>DocumentLibraryForm</Display>
-  <Edit>DocumentLibraryForm</Edit>
-  <New>DocumentLibraryForm</New>
-</FormTemplates>
-</file>
-
 <file path=customXml/item4.xml><?xml version="1.0" encoding="utf-8"?>
-<p:properties xmlns:p="http://schemas.microsoft.com/office/2006/metadata/properties" xmlns:xsi="http://www.w3.org/2001/XMLSchema-instance" xmlns:pc="http://schemas.microsoft.com/office/infopath/2007/PartnerControls">
-  <documentManagement/>
-</p:properties>
+<b:Sources xmlns:b="http://schemas.openxmlformats.org/officeDocument/2006/bibliography" xmlns="http://schemas.openxmlformats.org/officeDocument/2006/bibliography" SelectedStyle="\apasixtheditionofficeonline.xsl" StyleName="APA" Version="6"/>
 </file>
 
 <file path=customXml/itemProps1.xml><?xml version="1.0" encoding="utf-8"?>
-<ds:datastoreItem xmlns:ds="http://schemas.openxmlformats.org/officeDocument/2006/customXml" ds:itemID="{121C8915-2AA4-462B-99D1-DEE6F8E651FE}">
+<ds:datastoreItem xmlns:ds="http://schemas.openxmlformats.org/officeDocument/2006/customXml" ds:itemID="{45C8693C-5C48-43E9-A94F-CE03FAB861DF}">
   <ds:schemaRefs>
-    <ds:schemaRef ds:uri="http://schemas.openxmlformats.org/officeDocument/2006/bibliography"/>
+    <ds:schemaRef ds:uri="http://schemas.microsoft.com/office/2006/metadata/properties"/>
+    <ds:schemaRef ds:uri="http://schemas.microsoft.com/office/infopath/2007/PartnerControls"/>
   </ds:schemaRefs>
 </ds:datastoreItem>
 </file>
 
 <file path=customXml/itemProps2.xml><?xml version="1.0" encoding="utf-8"?>
+<ds:datastoreItem xmlns:ds="http://schemas.openxmlformats.org/officeDocument/2006/customXml" ds:itemID="{1A000BD8-9404-498E-B6EB-D94F5E220F24}">
+  <ds:schemaRefs>
+    <ds:schemaRef ds:uri="http://schemas.microsoft.com/sharepoint/v3/contenttype/forms"/>
+  </ds:schemaRefs>
+</ds:datastoreItem>
+</file>
+
+<file path=customXml/itemProps3.xml><?xml version="1.0" encoding="utf-8"?>
 <ds:datastoreItem xmlns:ds="http://schemas.openxmlformats.org/officeDocument/2006/customXml" ds:itemID="{B754E081-7CD2-45AD-8A91-BA1036282024}">
   <ds:schemaRefs>
     <ds:schemaRef ds:uri="http://schemas.microsoft.com/office/2006/metadata/contentType"/>
@@ -16396,19 +16363,10 @@
 </ds:datastoreItem>
 </file>
 
-<file path=customXml/itemProps3.xml><?xml version="1.0" encoding="utf-8"?>
-<ds:datastoreItem xmlns:ds="http://schemas.openxmlformats.org/officeDocument/2006/customXml" ds:itemID="{1A000BD8-9404-498E-B6EB-D94F5E220F24}">
+<file path=customXml/itemProps4.xml><?xml version="1.0" encoding="utf-8"?>
+<ds:datastoreItem xmlns:ds="http://schemas.openxmlformats.org/officeDocument/2006/customXml" ds:itemID="{121C8915-2AA4-462B-99D1-DEE6F8E651FE}">
   <ds:schemaRefs>
-    <ds:schemaRef ds:uri="http://schemas.microsoft.com/sharepoint/v3/contenttype/forms"/>
-  </ds:schemaRefs>
-</ds:datastoreItem>
-</file>
-
-<file path=customXml/itemProps4.xml><?xml version="1.0" encoding="utf-8"?>
-<ds:datastoreItem xmlns:ds="http://schemas.openxmlformats.org/officeDocument/2006/customXml" ds:itemID="{45C8693C-5C48-43E9-A94F-CE03FAB861DF}">
-  <ds:schemaRefs>
-    <ds:schemaRef ds:uri="http://schemas.microsoft.com/office/2006/metadata/properties"/>
-    <ds:schemaRef ds:uri="http://schemas.microsoft.com/office/infopath/2007/PartnerControls"/>
+    <ds:schemaRef ds:uri="http://schemas.openxmlformats.org/officeDocument/2006/bibliography"/>
   </ds:schemaRefs>
 </ds:datastoreItem>
 </file>
</xml_diff>